<commit_message>
Fase 24 plantilla word actualizada
</commit_message>
<xml_diff>
--- a/templates/inspection_report.docx
+++ b/templates/inspection_report.docx
@@ -392,12 +392,14 @@
         <w:rPr>
           <w:sz w:val="20"/>
           <w:szCs w:val="20"/>
-        </w:rPr>
-      </w:pPr>
-      <w:r>
-        <w:rPr>
-          <w:sz w:val="20"/>
-          <w:szCs w:val="20"/>
+          <w:lang w:val="en-GB"/>
+        </w:rPr>
+      </w:pPr>
+      <w:r>
+        <w:rPr>
+          <w:sz w:val="20"/>
+          <w:szCs w:val="20"/>
+          <w:lang w:val="en-GB"/>
         </w:rPr>
         <w:t>OVERVIEW PHOTO</w:t>
       </w:r>
@@ -407,43 +409,31 @@
         <w:rPr>
           <w:sz w:val="20"/>
           <w:szCs w:val="20"/>
-        </w:rPr>
-      </w:pPr>
-      <w:r>
-        <w:rPr>
-          <w:sz w:val="20"/>
-          <w:szCs w:val="20"/>
-        </w:rPr>
-        <w:t>{%</w:t>
-      </w:r>
-      <w:proofErr w:type="spellStart"/>
-      <w:r>
-        <w:rPr>
-          <w:sz w:val="20"/>
-          <w:szCs w:val="20"/>
-        </w:rPr>
-        <w:t>photo_overview</w:t>
-      </w:r>
-      <w:proofErr w:type="spellEnd"/>
-      <w:r>
-        <w:rPr>
-          <w:sz w:val="20"/>
-          <w:szCs w:val="20"/>
-        </w:rPr>
-        <w:t>}</w:t>
-      </w:r>
-    </w:p>
-    <w:p>
-      <w:pPr>
-        <w:rPr>
-          <w:sz w:val="20"/>
-          <w:szCs w:val="20"/>
-        </w:rPr>
-      </w:pPr>
-      <w:r>
-        <w:rPr>
-          <w:sz w:val="20"/>
-          <w:szCs w:val="20"/>
+          <w:lang w:val="en-GB"/>
+        </w:rPr>
+      </w:pPr>
+      <w:r>
+        <w:rPr>
+          <w:sz w:val="20"/>
+          <w:szCs w:val="20"/>
+          <w:lang w:val="en-GB"/>
+        </w:rPr>
+        <w:t>[Insert overview photo here]</w:t>
+      </w:r>
+    </w:p>
+    <w:p>
+      <w:pPr>
+        <w:rPr>
+          <w:sz w:val="20"/>
+          <w:szCs w:val="20"/>
+          <w:lang w:val="en-GB"/>
+        </w:rPr>
+      </w:pPr>
+      <w:r>
+        <w:rPr>
+          <w:sz w:val="20"/>
+          <w:szCs w:val="20"/>
+          <w:lang w:val="en-GB"/>
         </w:rPr>
         <w:t>DETAIL PHOTO</w:t>
       </w:r>
@@ -453,30 +443,16 @@
         <w:rPr>
           <w:sz w:val="20"/>
           <w:szCs w:val="20"/>
-        </w:rPr>
-      </w:pPr>
-      <w:r>
-        <w:rPr>
-          <w:sz w:val="20"/>
-          <w:szCs w:val="20"/>
-        </w:rPr>
-        <w:t>{%</w:t>
-      </w:r>
-      <w:proofErr w:type="spellStart"/>
-      <w:r>
-        <w:rPr>
-          <w:sz w:val="20"/>
-          <w:szCs w:val="20"/>
-        </w:rPr>
-        <w:t>photo_detail</w:t>
-      </w:r>
-      <w:proofErr w:type="spellEnd"/>
-      <w:r>
-        <w:rPr>
-          <w:sz w:val="20"/>
-          <w:szCs w:val="20"/>
-        </w:rPr>
-        <w:t>}</w:t>
+          <w:lang w:val="en-GB"/>
+        </w:rPr>
+      </w:pPr>
+      <w:r>
+        <w:rPr>
+          <w:sz w:val="20"/>
+          <w:szCs w:val="20"/>
+          <w:lang w:val="en-GB"/>
+        </w:rPr>
+        <w:t>[Insert detail photo here]</w:t>
       </w:r>
     </w:p>
     <w:sectPr>
@@ -1092,7 +1068,6 @@
   <w:style w:type="character" w:default="1" w:styleId="DefaultParagraphFont">
     <w:name w:val="Default Paragraph Font"/>
     <w:uiPriority w:val="1"/>
-    <w:semiHidden/>
     <w:unhideWhenUsed/>
   </w:style>
   <w:style w:type="table" w:default="1" w:styleId="TableNormal">

</xml_diff>